<commit_message>
docs(sqap): versión 1.2 del plan con familias crítico y matriz alineada a Jenkins
- Tabla 4, Anexos B y C y jest.config.ts: familias (US-20 y consulta del
  padre de US-11) pasa a ser módulo crítico con 90 % de cobertura (M06).
- matrices-sqap, hoja Métricas: cada umbral apunta a su etapa del
  Jenkinsfile y no a ci.yml, deploy.yml o perf.yml, que no existen;
  M01 y M02 con el mismo momento que la Tabla 9.
- Tabla 24: pdfkit en vez de pdfmake, y ioredis.
- Anexo F y glosario: pendientes cerrados con D1 a D20, cliente piloto
  (Unidad Educativa Nazareno), aprobación de US-17 a US-20, monitor
  UptimeRobot y canales WhatsApp y Discord.

Refs: US-20
</commit_message>
<xml_diff>
--- a/docs/sqap/SQAP-CalisFacu.docx
+++ b/docs/sqap/SQAP-CalisFacu.docx
@@ -50,7 +50,7 @@
           <w:color w:val="767171"/>
           <w:sz w:val="24"/>
         </w:rPr>
-        <w:t>Equipo L-001 · COM450 Calidad de Software · Universidad San Francisco Xavier · Gestión II/2026 · Versión del plan 1.1</w:t>
+        <w:t>Equipo L-001 · COM450 Calidad de Software · Universidad San Francisco Xavier · Gestión II/2026 · Versión del plan 1.2</w:t>
       </w:r>
     </w:p>
     <w:p>
@@ -247,7 +247,7 @@
               <w:rPr>
                 <w:sz w:val="20"/>
               </w:rPr>
-              <w:t>[Nombre de la unidad educativa piloto] — profesores y secretaría</w:t>
+              <w:t>Unidad Educativa Nazareno — directora Fabiana Parrado y profesora Fatima Carreño</w:t>
             </w:r>
           </w:p>
         </w:tc>
@@ -451,7 +451,7 @@
               <w:rPr>
                 <w:sz w:val="20"/>
               </w:rPr>
-              <w:t>1.1 · 13/10/2026</w:t>
+              <w:t>1.2 · 30/10/2026</w:t>
             </w:r>
           </w:p>
         </w:tc>
@@ -502,7 +502,7 @@
               <w:rPr>
                 <w:sz w:val="20"/>
               </w:rPr>
-              <w:t>Para revisión del docente</w:t>
+              <w:t>Vigente desde la versión 1.0; en ejecución (Sprint 3)</w:t>
             </w:r>
           </w:p>
         </w:tc>
@@ -595,7 +595,7 @@
         <w:t>Cómo leer este plan.</w:t>
       </w:r>
       <w:r>
-        <w:t xml:space="preserve"> Cada compromiso de calidad tiene un número, una herramienta que lo hace cumplir y una evidencia que queda archivada. Los números se definen una sola vez, en la Tabla de métricas de la Sección 5 (M01 a M16); las demás secciones se refieren a esas filas. Los textos entre corchetes, por ejemplo [Nombre de la unidad educativa piloto], son datos que el equipo debe completar; están listados en el Anexo F.</w:t>
+        <w:t xml:space="preserve"> Cada compromiso de calidad tiene un número, una herramienta que lo hace cumplir y una evidencia que queda archivada. Los números se definen una sola vez, en la Tabla de métricas de la Sección 5 (M01 a M16); las demás secciones se refieren a esas filas. Los datos que el equipo debía completar están en el Anexo F con su estado; desde la versión 1.2 no queda ninguno entre corchetes.</w:t>
       </w:r>
     </w:p>
     <w:p>
@@ -2783,7 +2783,7 @@
         <w:t>Fuera del alcance:</w:t>
       </w:r>
       <w:r>
-        <w:t xml:space="preserve"> el módulo de pagos (US-13, US-14, US-15 y US-16), propuesto para una versión posterior. Las historias US-17 a US-20 están sujetas a la aprobación del docente; si alguna no se aprueba, se retira de este plan con una entrada en la Sección 16.</w:t>
+        <w:t xml:space="preserve"> el módulo de pagos (US-13, US-14, US-15 y US-16), propuesto para una versión posterior. El docente aprobó las historias US-17 a US-20 y dejar los pagos fuera de la v1.0 (Anexo F).</w:t>
       </w:r>
     </w:p>
     <w:p>
@@ -3351,7 +3351,7 @@
               <w:rPr>
                 <w:sz w:val="20"/>
               </w:rPr>
-              <w:t>US-17, US-20</w:t>
+              <w:t>US-17</w:t>
             </w:r>
           </w:p>
         </w:tc>
@@ -3375,6 +3375,104 @@
                 <w:sz w:val="20"/>
               </w:rPr>
               <w:t>Decide quién lee o modifica datos de menores.</w:t>
+            </w:r>
+          </w:p>
+        </w:tc>
+      </w:tr>
+      <w:tr>
+        <w:trPr>
+          <w:cantSplit/>
+        </w:trPr>
+        <w:tc>
+          <w:tcPr>
+            <w:tcW w:w="2000" w:type="dxa"/>
+            <w:tcMar>
+              <w:top w:w="60" w:type="dxa"/>
+              <w:left w:w="100" w:type="dxa"/>
+              <w:bottom w:w="60" w:type="dxa"/>
+              <w:right w:w="100" w:type="dxa"/>
+            </w:tcMar>
+            <w:vAlign w:val="center"/>
+          </w:tcPr>
+          <w:p>
+            <w:pPr>
+              <w:spacing w:after="0" w:line="260" w:lineRule="auto"/>
+            </w:pPr>
+            <w:r>
+              <w:rPr>
+                <w:sz w:val="20"/>
+              </w:rPr>
+              <w:t>Vínculo familiar</w:t>
+            </w:r>
+          </w:p>
+        </w:tc>
+        <w:tc>
+          <w:tcPr>
+            <w:tcW w:w="2700" w:type="dxa"/>
+            <w:tcMar>
+              <w:top w:w="60" w:type="dxa"/>
+              <w:left w:w="100" w:type="dxa"/>
+              <w:bottom w:w="60" w:type="dxa"/>
+              <w:right w:w="100" w:type="dxa"/>
+            </w:tcMar>
+            <w:vAlign w:val="center"/>
+          </w:tcPr>
+          <w:p>
+            <w:pPr>
+              <w:spacing w:after="0" w:line="260" w:lineRule="auto"/>
+            </w:pPr>
+            <w:r>
+              <w:rPr>
+                <w:rFonts w:ascii="Consolas" w:hAnsi="Consolas" w:cs="Consolas"/>
+                <w:sz w:val="19"/>
+              </w:rPr>
+              <w:t>api/src/modules/familias</w:t>
+            </w:r>
+          </w:p>
+        </w:tc>
+        <w:tc>
+          <w:tcPr>
+            <w:tcW w:w="2000" w:type="dxa"/>
+            <w:tcMar>
+              <w:top w:w="60" w:type="dxa"/>
+              <w:left w:w="100" w:type="dxa"/>
+              <w:bottom w:w="60" w:type="dxa"/>
+              <w:right w:w="100" w:type="dxa"/>
+            </w:tcMar>
+            <w:vAlign w:val="center"/>
+          </w:tcPr>
+          <w:p>
+            <w:pPr>
+              <w:spacing w:after="0" w:line="260" w:lineRule="auto"/>
+            </w:pPr>
+            <w:r>
+              <w:rPr>
+                <w:sz w:val="20"/>
+              </w:rPr>
+              <w:t>US-20, US-11 (consulta del padre)</w:t>
+            </w:r>
+          </w:p>
+        </w:tc>
+        <w:tc>
+          <w:tcPr>
+            <w:tcW w:w="3380" w:type="dxa"/>
+            <w:tcMar>
+              <w:top w:w="60" w:type="dxa"/>
+              <w:left w:w="100" w:type="dxa"/>
+              <w:bottom w:w="60" w:type="dxa"/>
+              <w:right w:w="100" w:type="dxa"/>
+            </w:tcMar>
+            <w:vAlign w:val="center"/>
+          </w:tcPr>
+          <w:p>
+            <w:pPr>
+              <w:spacing w:after="0" w:line="260" w:lineRule="auto"/>
+            </w:pPr>
+            <w:r>
+              <w:rPr>
+                <w:sz w:val="20"/>
+              </w:rPr>
+              <w:t>Decide qué padre ve los datos y el boletín de cada menor.</w:t>
             </w:r>
           </w:p>
         </w:tc>
@@ -5175,7 +5273,7 @@
         <w:t>Galvan</w:t>
       </w:r>
       <w:r>
-        <w:t xml:space="preserve"> es Responsable SQA y Desarrollador frontend / Tester. El cliente es [Nombre de la unidad educativa piloto], representado por un profesor y la secretaria, que actúan como dueños del producto.</w:t>
+        <w:t xml:space="preserve"> es Responsable SQA y Desarrollador frontend / Tester. El cliente es la Unidad Educativa Nazareno, representada por la directora Fabiana Parrado y la profesora Fatima Carreño, que actúan como dueños del producto.</w:t>
       </w:r>
     </w:p>
     <w:p>
@@ -11508,20 +11606,18 @@
               <w:rPr>
                 <w:sz w:val="18"/>
               </w:rPr>
-              <w:t xml:space="preserve">Monitor externo cada 5 min sobre </w:t>
+              <w:t>UptimeRobot cada 5 min sobre /api/salud; desde el release v1.0</w:t>
             </w:r>
             <w:r>
               <w:rPr>
                 <w:rFonts w:ascii="Consolas" w:hAnsi="Consolas" w:cs="Consolas"/>
                 <w:sz w:val="17"/>
               </w:rPr>
-              <w:t>/api/salud</w:t>
             </w:r>
             <w:r>
               <w:rPr>
                 <w:sz w:val="18"/>
               </w:rPr>
-              <w:t>; desde el release v1.0</w:t>
             </w:r>
           </w:p>
         </w:tc>
@@ -12855,7 +12951,7 @@
               <w:rPr>
                 <w:sz w:val="19"/>
               </w:rPr>
-              <w:t>Monitor externo</w:t>
+              <w:t>UptimeRobot</w:t>
             </w:r>
           </w:p>
         </w:tc>
@@ -13329,6 +13425,24 @@
           <w:sz w:val="17"/>
         </w:rPr>
         <w:t xml:space="preserve">  './src/modules/auth/':      { lines: 90 },</w:t>
+      </w:r>
+    </w:p>
+    <w:p>
+      <w:pPr>
+        <w:keepLines/>
+        <w:pBdr>
+          <w:left w:val="single" w:color="9DBBD8" w:sz="12" w:space="6"/>
+        </w:pBdr>
+        <w:shd w:fill="F2F2F2" w:color="auto" w:val="clear"/>
+        <w:spacing w:after="0" w:before="0" w:line="240"/>
+        <w:ind w:left="170" w:right="170"/>
+      </w:pPr>
+      <w:r>
+        <w:rPr>
+          <w:rFonts w:ascii="Consolas" w:hAnsi="Consolas" w:cs="Consolas" w:eastAsia="Consolas"/>
+          <w:sz w:val="17"/>
+        </w:rPr>
+        <w:t xml:space="preserve">  './src/modules/familias/':  { lines: 90 },</w:t>
       </w:r>
     </w:p>
     <w:p>
@@ -14482,7 +14596,7 @@
               <w:rPr>
                 <w:sz w:val="17"/>
               </w:rPr>
-              <w:t>Cliente (profesor y secretaria) con el equipo</w:t>
+              <w:t>Cliente (directora y profesora) con el equipo</w:t>
             </w:r>
           </w:p>
         </w:tc>
@@ -17617,7 +17731,7 @@
               <w:rPr>
                 <w:sz w:val="18"/>
               </w:rPr>
-              <w:t>TDD obligatorio en los cuatro módulos críticos; Jest. Aritmética decimal (decimal.js) en el cálculo.</w:t>
+              <w:t>TDD obligatorio en los cinco módulos críticos; Jest. Aritmética decimal (decimal.js) en el cálculo.</w:t>
             </w:r>
           </w:p>
         </w:tc>
@@ -22415,7 +22529,7 @@
               <w:rPr>
                 <w:sz w:val="19"/>
               </w:rPr>
-              <w:t>Monitor externo de disponibilidad [elegir proveedor]</w:t>
+              <w:t>UptimeRobot (plan gratuito): monitor HTTP de /api/salud de staging y de producción</w:t>
             </w:r>
           </w:p>
         </w:tc>
@@ -22512,7 +22626,7 @@
               <w:rPr>
                 <w:sz w:val="19"/>
               </w:rPr>
-              <w:t>GitHub Issues; [canal de chat del equipo]</w:t>
+              <w:t>GitHub Issues; grupo de WhatsApp (avisos urgentes, S1) y servidor de Discord (coordinación diaria)</w:t>
             </w:r>
           </w:p>
         </w:tc>
@@ -22752,7 +22866,7 @@
         <w:t>Técnicas:</w:t>
       </w:r>
       <w:r>
-        <w:t xml:space="preserve"> TDD obligatorio en los cuatro módulos críticos; BDD ligero, porque los criterios Dado/Cuando/Entonces se convierten en nombres de pruebas; revisión de cada commit de develop y del PR de release a main (Sección 6, ADR-0008); análisis estático en cada build; integración continua con despliegue continuo a staging; pair programming de una hora por semana sobre los módulos críticos para transferir conocimiento (mitigación de R01). Marco de trabajo: Scrum adaptado a sprints de una semana (planificación el día 1, revisión y retrospectiva el día 5).</w:t>
+        <w:t xml:space="preserve"> TDD obligatorio en los cinco módulos críticos; BDD ligero, porque los criterios Dado/Cuando/Entonces se convierten en nombres de pruebas; revisión de cada commit de develop y del PR de release a main (Sección 6, ADR-0008); análisis estático en cada build; integración continua con despliegue continuo a staging; pair programming de una hora por semana sobre los módulos críticos para transferir conocimiento (mitigación de R01). Marco de trabajo: Scrum adaptado a sprints de una semana (planificación el día 1, revisión y retrospectiva el día 5).</w:t>
       </w:r>
     </w:p>
     <w:p>
@@ -26546,7 +26660,7 @@
               <w:rPr>
                 <w:sz w:val="19"/>
               </w:rPr>
-              <w:t>pdfmake</w:t>
+              <w:t>pdfkit</w:t>
             </w:r>
           </w:p>
         </w:tc>
@@ -26592,7 +26706,7 @@
               <w:rPr>
                 <w:sz w:val="19"/>
               </w:rPr>
-              <w:t>Boletín y centralizador en PDF (US-07, US-09)</w:t>
+              <w:t>Boletín en PDF (US-07); se usa directo, sin pdfmake</w:t>
             </w:r>
           </w:p>
         </w:tc>
@@ -26620,7 +26734,7 @@
               <w:rPr>
                 <w:sz w:val="19"/>
               </w:rPr>
-              <w:t>BullMQ</w:t>
+              <w:t>BullMQ + ioredis</w:t>
             </w:r>
           </w:p>
         </w:tc>
@@ -28868,7 +28982,7 @@
               <w:rPr>
                 <w:sz w:val="18"/>
               </w:rPr>
-              <w:t xml:space="preserve">Panel del monitor externo; exportación mensual en </w:t>
+              <w:t xml:space="preserve">Panel de UptimeRobot; exportación mensual en </w:t>
             </w:r>
             <w:r>
               <w:rPr>
@@ -34814,7 +34928,7 @@
               <w:rPr>
                 <w:sz w:val="19"/>
               </w:rPr>
-              <w:t>Nota de una materia en la gestión, calculada a partir de las tres notas trimestrales (Anexo F: confirmar la regla).</w:t>
+              <w:t>Nota de una materia en la gestión, promedio de las tres notas trimestrales redondeado al entero, 0,5 hacia arriba (decisión D3).</w:t>
             </w:r>
           </w:p>
         </w:tc>
@@ -38666,6 +38780,126 @@
           </w:p>
         </w:tc>
       </w:tr>
+      <w:tr>
+        <w:trPr>
+          <w:cantSplit/>
+        </w:trPr>
+        <w:tc>
+          <w:tcPr>
+            <w:tcW w:w="800" w:type="dxa"/>
+            <w:tcMar>
+              <w:top w:w="60" w:type="dxa"/>
+              <w:left w:w="100" w:type="dxa"/>
+              <w:bottom w:w="60" w:type="dxa"/>
+              <w:right w:w="100" w:type="dxa"/>
+            </w:tcMar>
+            <w:vAlign w:val="center"/>
+          </w:tcPr>
+          <w:p>
+            <w:pPr>
+              <w:spacing w:after="0" w:line="260" w:lineRule="auto"/>
+            </w:pPr>
+            <w:r>
+              <w:rPr>
+                <w:sz w:val="18"/>
+              </w:rPr>
+              <w:t>1.2</w:t>
+            </w:r>
+          </w:p>
+        </w:tc>
+        <w:tc>
+          <w:tcPr>
+            <w:tcW w:w="1150" w:type="dxa"/>
+            <w:tcMar>
+              <w:top w:w="60" w:type="dxa"/>
+              <w:left w:w="100" w:type="dxa"/>
+              <w:bottom w:w="60" w:type="dxa"/>
+              <w:right w:w="100" w:type="dxa"/>
+            </w:tcMar>
+            <w:vAlign w:val="center"/>
+          </w:tcPr>
+          <w:p>
+            <w:pPr>
+              <w:spacing w:after="0" w:line="260" w:lineRule="auto"/>
+            </w:pPr>
+            <w:r>
+              <w:rPr>
+                <w:sz w:val="18"/>
+              </w:rPr>
+              <w:t>30/10/2026</w:t>
+            </w:r>
+          </w:p>
+        </w:tc>
+        <w:tc>
+          <w:tcPr>
+            <w:tcW w:w="6130" w:type="dxa"/>
+            <w:tcMar>
+              <w:top w:w="60" w:type="dxa"/>
+              <w:left w:w="100" w:type="dxa"/>
+              <w:bottom w:w="60" w:type="dxa"/>
+              <w:right w:w="100" w:type="dxa"/>
+            </w:tcMar>
+            <w:vAlign w:val="center"/>
+          </w:tcPr>
+          <w:p>
+            <w:pPr>
+              <w:spacing w:after="0" w:line="260" w:lineRule="auto"/>
+            </w:pPr>
+            <w:r>
+              <w:rPr>
+                <w:sz w:val="18"/>
+              </w:rPr>
+              <w:t>Revisión de consistencia antes del cierre del Sprint 3. Sección 1, Anexo B y Anexo C: familias (vínculo padre–estudiante, US-20 y consulta del padre de US-11) pasa a ser módulo crítico y entra al coverageThreshold de M06. Sección 11: pdfkit reemplaza a pdfmake y se agrega ioredis. Sección 15 y Anexo F: los pendientes de reglas se cierran con las decisiones D1 a D20. matrices-sqap.xlsx, hoja Métricas: la columna "Dónde se configura" nombra las etapas del Jenkinsfile y no workflows de GitHub Actions que no existen, y M02 se mide en cada build de develop, como dice la Tabla 9. Tabla 1, Sección 3 y Anexo F: cliente piloto, la Unidad Educativa Nazareno, representada por la directora Fabiana Parrado y la profesora Fatima Carreño. Sección 1 y Anexo F: el docente aprobó US-17 a US-20 y dejar los pagos fuera. Sección 9 y 12: el monitor de M13 es UptimeRobot y el equipo se comunica por WhatsApp y Discord.</w:t>
+            </w:r>
+          </w:p>
+        </w:tc>
+        <w:tc>
+          <w:tcPr>
+            <w:tcW w:w="1000" w:type="dxa"/>
+            <w:tcMar>
+              <w:top w:w="60" w:type="dxa"/>
+              <w:left w:w="100" w:type="dxa"/>
+              <w:bottom w:w="60" w:type="dxa"/>
+              <w:right w:w="100" w:type="dxa"/>
+            </w:tcMar>
+            <w:vAlign w:val="center"/>
+          </w:tcPr>
+          <w:p>
+            <w:pPr>
+              <w:spacing w:after="0" w:line="260" w:lineRule="auto"/>
+            </w:pPr>
+            <w:r>
+              <w:rPr>
+                <w:sz w:val="18"/>
+              </w:rPr>
+              <w:t>Lujan</w:t>
+            </w:r>
+          </w:p>
+        </w:tc>
+        <w:tc>
+          <w:tcPr>
+            <w:tcW w:w="1000" w:type="dxa"/>
+            <w:tcMar>
+              <w:top w:w="60" w:type="dxa"/>
+              <w:left w:w="100" w:type="dxa"/>
+              <w:bottom w:w="60" w:type="dxa"/>
+              <w:right w:w="100" w:type="dxa"/>
+            </w:tcMar>
+            <w:vAlign w:val="center"/>
+          </w:tcPr>
+          <w:p>
+            <w:pPr>
+              <w:spacing w:after="0" w:line="260" w:lineRule="auto"/>
+            </w:pPr>
+            <w:r>
+              <w:rPr>
+                <w:sz w:val="18"/>
+              </w:rPr>
+              <w:t>Galvan</w:t>
+            </w:r>
+          </w:p>
+        </w:tc>
+      </w:tr>
     </w:tbl>
     <w:p>
       <w:pPr>
@@ -38677,7 +38911,7 @@
         <w:spacing w:after="120" w:line="276" w:lineRule="auto"/>
       </w:pPr>
       <w:r>
-        <w:t>Rige desde la versión 1.0, antes del inicio de la semana 1. Las versiones 0.3 a 0.11 se registran por separado para que cada corrección sea identificable, como pide la Práctica 7.</w:t>
+        <w:t>Rige desde la versión 1.0, antes del inicio de la semana 1. Las versiones 0.2 a 0.13 se registran por separado para que cada corrección sea identificable, como pide la Práctica 7.</w:t>
       </w:r>
     </w:p>
     <w:p>
@@ -40646,7 +40880,7 @@
               <w:rPr>
                 <w:sz w:val="18"/>
               </w:rPr>
-              <w:t>auth (crítico)</w:t>
+              <w:t>familias (crítico)</w:t>
             </w:r>
           </w:p>
         </w:tc>
@@ -40692,7 +40926,7 @@
               <w:rPr>
                 <w:sz w:val="18"/>
               </w:rPr>
-              <w:t>M09</w:t>
+              <w:t>M09, M06</w:t>
             </w:r>
           </w:p>
         </w:tc>
@@ -40743,7 +40977,7 @@
               <w:rPr>
                 <w:sz w:val="18"/>
               </w:rPr>
-              <w:t>boletin</w:t>
+              <w:t>boletin; familias (consulta del padre)</w:t>
             </w:r>
           </w:p>
         </w:tc>
@@ -40789,7 +41023,7 @@
               <w:rPr>
                 <w:sz w:val="18"/>
               </w:rPr>
-              <w:t>M02, M09</w:t>
+              <w:t>M02, M09, M06</w:t>
             </w:r>
           </w:p>
         </w:tc>
@@ -45916,6 +46150,24 @@
           <w:sz w:val="17"/>
         </w:rPr>
         <w:t xml:space="preserve">    './src/modules/auth/':      { lines: 90 },</w:t>
+      </w:r>
+    </w:p>
+    <w:p>
+      <w:pPr>
+        <w:keepLines/>
+        <w:pBdr>
+          <w:left w:val="single" w:color="9DBBD8" w:sz="12" w:space="6"/>
+        </w:pBdr>
+        <w:shd w:fill="F2F2F2" w:color="auto" w:val="clear"/>
+        <w:spacing w:after="0" w:before="0" w:line="240"/>
+        <w:ind w:left="170" w:right="170"/>
+      </w:pPr>
+      <w:r>
+        <w:rPr>
+          <w:rFonts w:ascii="Consolas" w:hAnsi="Consolas" w:cs="Consolas" w:eastAsia="Consolas"/>
+          <w:sz w:val="17"/>
+        </w:rPr>
+        <w:t xml:space="preserve">    './src/modules/familias/':  { lines: 90 },</w:t>
       </w:r>
     </w:p>
     <w:p>
@@ -48562,7 +48814,7 @@
         <w:spacing w:after="120" w:line="276" w:lineRule="auto"/>
       </w:pPr>
       <w:r>
-        <w:t>El plan rige con estos supuestos; cada uno se resuelve en la semana 1 y se registra en la Sección 16.</w:t>
+        <w:t>El plan rige con estos supuestos. Las reglas del cálculo y de la asistencia se resolvieron con las decisiones D1 a D20 de docs/backlog/reglas-ministerio.md (13/10/2026 en adelante); la última columna indica el estado al 30/10/2026. Lo que sigue abierto se registra en la Sección 16 cuando se resuelva.</w:t>
       </w:r>
     </w:p>
     <w:p>
@@ -48683,7 +48935,7 @@
                 <w:b/>
                 <w:sz w:val="20"/>
               </w:rPr>
-              <w:t>Cuándo</w:t>
+              <w:t>Estado al 30/10/2026</w:t>
             </w:r>
           </w:p>
         </w:tc>
@@ -48781,7 +49033,7 @@
               <w:rPr>
                 <w:sz w:val="20"/>
               </w:rPr>
-              <w:t>Semana 1, día 1</w:t>
+              <w:t>Resuelto (30/10/2026): Unidad Educativa Nazareno; directora Fabiana Parrado y profesora Fatima Carreño.</w:t>
             </w:r>
           </w:p>
         </w:tc>
@@ -48878,7 +49130,7 @@
               <w:rPr>
                 <w:sz w:val="20"/>
               </w:rPr>
-              <w:t>Semana 1, día 1</w:t>
+              <w:t>Resuelto: el docente aprobó US-17 a US-20 y dejar los pagos fuera (confirmado el 30/10/2026).</w:t>
             </w:r>
           </w:p>
         </w:tc>
@@ -48975,7 +49227,7 @@
               <w:rPr>
                 <w:sz w:val="20"/>
               </w:rPr>
-              <w:t>Semana 1, día 1</w:t>
+              <w:t>Resuelto: D3 (promedio de los tres trimestres, redondeo D2).</w:t>
             </w:r>
           </w:p>
         </w:tc>
@@ -49072,7 +49324,7 @@
               <w:rPr>
                 <w:sz w:val="20"/>
               </w:rPr>
-              <w:t>Semana 1, día 1</w:t>
+              <w:t>Resuelto: D1 (no; mínimo 1) y D2 (0,5 hacia arriba, al final de la suma).</w:t>
             </w:r>
           </w:p>
         </w:tc>
@@ -49169,7 +49421,7 @@
               <w:rPr>
                 <w:sz w:val="20"/>
               </w:rPr>
-              <w:t>Semana 1, día 1</w:t>
+              <w:t>Resuelto: D5 (la licencia cuenta) y D6 (en riesgo: promedio &lt; 51 o asistencia &lt; 80 %, configurable).</w:t>
             </w:r>
           </w:p>
         </w:tc>
@@ -49266,7 +49518,7 @@
               <w:rPr>
                 <w:sz w:val="20"/>
               </w:rPr>
-              <w:t>Semana 1, día 1</w:t>
+              <w:t>Resuelto: US-02 se mantuvo en la semana 1 (backlog v2.0, Tabla 3).</w:t>
             </w:r>
           </w:p>
         </w:tc>
@@ -49363,7 +49615,7 @@
               <w:rPr>
                 <w:sz w:val="20"/>
               </w:rPr>
-              <w:t>Semana 2</w:t>
+              <w:t>Monitor resuelto (30/10/2026): UptimeRobot. Correo: abierto hasta US-08 y US-12 (Sprint 4).</w:t>
             </w:r>
           </w:p>
         </w:tc>

</xml_diff>

<commit_message>
docs(sqap): Quality Gate "Sonar way" y M05, M07 y M08 en cada build de develop
SonarQube Cloud quedó conectado (T-030). Secciones 5 y 9, Anexo C,
matrices-sqap y metricas.md: el gate se llama "Sonar way" y se mide en
develop, la única rama que analiza el plan gratuito. Los umbrales no
cambian.

Refs: T-030
</commit_message>
<xml_diff>
--- a/docs/sqap/SQAP-CalisFacu.docx
+++ b/docs/sqap/SQAP-CalisFacu.docx
@@ -10241,7 +10241,7 @@
               <w:rPr>
                 <w:sz w:val="18"/>
               </w:rPr>
-              <w:t>Jest (lcov) + SonarQube Cloud (P3); en cada PR</w:t>
+              <w:t>Jest (lcov) + SonarQube Cloud (P3); en cada build de develop</w:t>
             </w:r>
           </w:p>
         </w:tc>
@@ -10540,7 +10540,7 @@
               <w:rPr>
                 <w:sz w:val="18"/>
               </w:rPr>
-              <w:t>SonarQube Cloud (P3); en cada PR</w:t>
+              <w:t>SonarQube Cloud (P3); en cada build de develop</w:t>
             </w:r>
           </w:p>
         </w:tc>
@@ -10865,7 +10865,7 @@
               <w:rPr>
                 <w:sz w:val="18"/>
               </w:rPr>
-              <w:t xml:space="preserve"> + Dependabot; en cada PR</w:t>
+              <w:t xml:space="preserve"> + Dependabot; SonarQube en cada build de develop, npm audit en cada build</w:t>
             </w:r>
           </w:p>
         </w:tc>
@@ -12445,7 +12445,7 @@
               <w:rPr>
                 <w:sz w:val="19"/>
               </w:rPr>
-              <w:t>Quality Gate "CalisFacu" de SonarQube Cloud</w:t>
+              <w:t>Quality Gate "Sonar way" de SonarQube Cloud</w:t>
             </w:r>
           </w:p>
         </w:tc>
@@ -12614,7 +12614,7 @@
               <w:rPr>
                 <w:sz w:val="19"/>
               </w:rPr>
-              <w:t>Quality Gate "CalisFacu"</w:t>
+              <w:t>Quality Gate "Sonar way"</w:t>
             </w:r>
           </w:p>
         </w:tc>
@@ -13586,7 +13586,7 @@
           <w:rFonts w:ascii="Consolas" w:hAnsi="Consolas" w:cs="Consolas" w:eastAsia="Consolas"/>
           <w:sz w:val="17"/>
         </w:rPr>
-        <w:t>Quality Gate "CalisFacu" (SonarQube Cloud):</w:t>
+        <w:t>Quality Gate "Sonar way" (SonarQube Cloud):</w:t>
       </w:r>
     </w:p>
     <w:p>
@@ -21919,7 +21919,7 @@
               <w:rPr>
                 <w:sz w:val="19"/>
               </w:rPr>
-              <w:t>SonarQube Cloud, Quality Gate "CalisFacu"; ESLint + Prettier</w:t>
+              <w:t>SonarQube Cloud, Quality Gate "Sonar way"; ESLint + Prettier</w:t>
             </w:r>
           </w:p>
         </w:tc>
@@ -22852,7 +22852,7 @@
         <w:t>-Dsonar.qualitygate.wait=true</w:t>
       </w:r>
       <w:r>
-        <w:t>, de modo que la etapa espera el resultado del Quality Gate sin necesitar un webhook hacia el Jenkins local.</w:t>
+        <w:t>, de modo que la etapa espera el resultado del Quality Gate sin necesitar un webhook hacia el Jenkins local. El plan gratuito no permite asignar un Quality Gate propio al proyecto, así que se usa el integrado "Sonar way": sus condiciones sobre el código nuevo incluyen las tres del plan con los mismos umbrales (cobertura menor que 80 %, duplicación mayor que 3 % y seguridad peor que A) y además exigen confiabilidad y mantenibilidad A y el 100 % de los security hotspots revisados. Ese plan, además, solo analiza la rama principal del proyecto, que en SonarQube Cloud es develop: el análisis corre en cada build de develop, donde se trabaja (ADR-0008), y el PR de release a main se apoya en el Quality Gate del último commit de develop.</w:t>
       </w:r>
     </w:p>
     <w:p>
@@ -38849,7 +38849,7 @@
               <w:rPr>
                 <w:sz w:val="18"/>
               </w:rPr>
-              <w:t>Revisión de consistencia antes del cierre del Sprint 3. Sección 1, Anexo B y Anexo C: familias (vínculo padre–estudiante, US-20 y consulta del padre de US-11) pasa a ser módulo crítico y entra al coverageThreshold de M06. Sección 11: pdfkit reemplaza a pdfmake y se agrega ioredis. Sección 15 y Anexo F: los pendientes de reglas se cierran con las decisiones D1 a D20. matrices-sqap.xlsx, hoja Métricas: la columna "Dónde se configura" nombra las etapas del Jenkinsfile y no workflows de GitHub Actions que no existen, y M02 se mide en cada build de develop, como dice la Tabla 9. Tabla 1, Sección 3 y Anexo F: cliente piloto, la Unidad Educativa Nazareno, representada por la directora Fabiana Parrado y la profesora Fatima Carreño. Sección 1 y Anexo F: el docente aprobó US-17 a US-20 y dejar los pagos fuera. Sección 9 y 12: el monitor de M13 es UptimeRobot y el equipo se comunica por WhatsApp y Discord.</w:t>
+              <w:t>Revisión de consistencia antes del cierre del Sprint 3. Sección 1, Anexo B y Anexo C: familias (vínculo padre–estudiante, US-20 y consulta del padre de US-11) pasa a ser módulo crítico y entra al coverageThreshold de M06. Sección 11: pdfkit reemplaza a pdfmake y se agrega ioredis. Sección 15 y Anexo F: los pendientes de reglas se cierran con las decisiones D1 a D20. matrices-sqap.xlsx, hoja Métricas: la columna "Dónde se configura" nombra las etapas del Jenkinsfile y no workflows de GitHub Actions que no existen, y M02 se mide en cada build de develop, como dice la Tabla 9. Tabla 1, Sección 3 y Anexo F: cliente piloto, la Unidad Educativa Nazareno, representada por la directora Fabiana Parrado y la profesora Fatima Carreño. Sección 1 y Anexo F: el docente aprobó US-17 a US-20 y dejar los pagos fuera. Sección 9 y 12: el monitor de M13 es UptimeRobot y el equipo se comunica por WhatsApp y Discord. Secciones 5 y 9 y Anexo C: SonarQube Cloud se conectó el 30/10/2026 (T-030); el Quality Gate es "Sonar way", porque el plan gratuito no permite uno propio, y contiene las condiciones de M05, M07 y M08 con los mismos umbrales; como el plan gratuito solo analiza la rama principal, esta es develop y M05, M07 y M08 se miden en cada build de develop.</w:t>
             </w:r>
           </w:p>
         </w:tc>
@@ -42885,7 +42885,7 @@
           <w:rFonts w:ascii="Consolas" w:hAnsi="Consolas" w:cs="Consolas" w:eastAsia="Consolas"/>
           <w:sz w:val="17"/>
         </w:rPr>
-        <w:t xml:space="preserve">    stage('Análisis estático') {                           // M05, M07, M08: Quality Gate "CalisFacu"</w:t>
+        <w:t xml:space="preserve">    stage('Análisis estático') {                           // M05, M07, M08: Quality Gate "Sonar way"</w:t>
       </w:r>
     </w:p>
     <w:p>

</xml_diff>

<commit_message>
docs(sqap): rama por defecto develop, rulesets y respaldos de staging
Sección 10.2: develop es la rama por defecto en GitHub (los respaldos
programados y Dependabot se leen de ella); main y develop protegidas con
rulesets, con el administrador como única excepción en main. Sección 3:
Galvan no puede saltar el check de Jenkins. Tabla 22: staging se respalda
hasta que exista producción; primera restauración con 19 tablas y RTO de
1 s.

Refs: T-030
</commit_message>
<xml_diff>
--- a/docs/sqap/SQAP-CalisFacu.docx
+++ b/docs/sqap/SQAP-CalisFacu.docx
@@ -5926,48 +5926,36 @@
         <w:spacing w:after="80" w:line="276" w:lineRule="auto"/>
       </w:pPr>
       <w:r>
-        <w:t xml:space="preserve">Galvan mantiene el pipeline que mide su propio código: todo cambio en el </w:t>
+        <w:t>Galvan mantiene el pipeline que mide su propio código: todo cambio en el Jenkinsfile y en jenkins/ lo aprueba Lujan, y la rama main exige el check de Jenkins y Galvan no puede saltarlo; solo el administrador del repositorio (Lujan) puede, y cada uso queda en el acta de la auditoría siguiente.</w:t>
       </w:r>
       <w:r>
         <w:rPr>
           <w:rFonts w:ascii="Consolas" w:hAnsi="Consolas" w:cs="Consolas"/>
           <w:sz w:val="19"/>
         </w:rPr>
-        <w:t>Jenkinsfile</w:t>
-      </w:r>
-      <w:r>
-        <w:t xml:space="preserve"> y en </w:t>
-      </w:r>
+      </w:r>
+      <w:r/>
       <w:r>
         <w:rPr>
           <w:rFonts w:ascii="Consolas" w:hAnsi="Consolas" w:cs="Consolas"/>
           <w:sz w:val="19"/>
         </w:rPr>
-        <w:t>jenkins/</w:t>
-      </w:r>
-      <w:r>
-        <w:t xml:space="preserve"> lo aprueba Lujan, y las ramas </w:t>
-      </w:r>
+      </w:r>
+      <w:r/>
       <w:r>
         <w:rPr>
           <w:rFonts w:ascii="Consolas" w:hAnsi="Consolas" w:cs="Consolas"/>
           <w:sz w:val="19"/>
         </w:rPr>
-        <w:t>develop</w:t>
-      </w:r>
-      <w:r>
-        <w:t xml:space="preserve"> y </w:t>
-      </w:r>
+      </w:r>
+      <w:r/>
       <w:r>
         <w:rPr>
           <w:rFonts w:ascii="Consolas" w:hAnsi="Consolas" w:cs="Consolas"/>
           <w:sz w:val="19"/>
         </w:rPr>
-        <w:t>main</w:t>
-      </w:r>
-      <w:r>
-        <w:t xml:space="preserve"> exigen el check de Jenkins aunque el autor sea administrador.</w:t>
-      </w:r>
+      </w:r>
+      <w:r/>
     </w:p>
     <w:p>
       <w:pPr>
@@ -23453,39 +23441,34 @@
                 <w:rFonts w:ascii="Consolas" w:hAnsi="Consolas" w:cs="Consolas"/>
                 <w:sz w:val="18"/>
               </w:rPr>
-              <w:t>main</w:t>
-            </w:r>
-            <w:r>
-              <w:rPr>
-                <w:sz w:val="19"/>
-              </w:rPr>
-              <w:t xml:space="preserve"> (producción, solo versiones etiquetadas </w:t>
+              <w:t>main (producción, solo versiones etiquetadas vX.Y.Z) y develop (integración, se despliega a staging en cada merge). develop es la rama por defecto en GitHub, porque los respaldos programados y Dependabot se leen de ella.</w:t>
+            </w:r>
+            <w:r>
+              <w:rPr>
+                <w:sz w:val="19"/>
+              </w:rPr>
             </w:r>
             <w:r>
               <w:rPr>
                 <w:rFonts w:ascii="Consolas" w:hAnsi="Consolas" w:cs="Consolas"/>
                 <w:sz w:val="18"/>
               </w:rPr>
-              <w:t>vX.Y.Z</w:t>
-            </w:r>
-            <w:r>
-              <w:rPr>
-                <w:sz w:val="19"/>
-              </w:rPr>
-              <w:t xml:space="preserve">) y </w:t>
+            </w:r>
+            <w:r>
+              <w:rPr>
+                <w:sz w:val="19"/>
+              </w:rPr>
             </w:r>
             <w:r>
               <w:rPr>
                 <w:rFonts w:ascii="Consolas" w:hAnsi="Consolas" w:cs="Consolas"/>
                 <w:sz w:val="18"/>
               </w:rPr>
-              <w:t>develop</w:t>
-            </w:r>
-            <w:r>
-              <w:rPr>
-                <w:sz w:val="19"/>
-              </w:rPr>
-              <w:t xml:space="preserve"> (integración, se despliega a staging en cada merge).</w:t>
+            </w:r>
+            <w:r>
+              <w:rPr>
+                <w:sz w:val="19"/>
+              </w:rPr>
             </w:r>
           </w:p>
         </w:tc>
@@ -23853,7 +23836,7 @@
               <w:rPr>
                 <w:sz w:val="19"/>
               </w:rPr>
-              <w:t>main: pull request obligatorio con 1 aprobación; descartar aprobaciones si llegan commits nuevos; check obligatorio de Jenkins (continuous-integration/jenkins/pr-merge); rama al día con la destino; sin excepción para administradores. develop: sin PR obligatorio. Ambas: sin force push ni borrado.</w:t>
+              <w:t>main: pull request obligatorio con 1 aprobación; descartar aprobaciones si llegan commits nuevos; check obligatorio de Jenkins (continuous-integration/jenkins/pr-merge); rama al día con la destino; única excepción: el rol administrador del repositorio (Lujan, Líder), para publicar un release cuando el otro integrante no puede revisar; cada uso se registra en el acta de la auditoría siguiente. develop: sin PR obligatorio. Ambas: sin force push ni borrado (rulesets "Protección de main" y "Protección de develop").</w:t>
             </w:r>
             <w:r>
               <w:rPr>
@@ -25138,7 +25121,7 @@
               <w:rPr>
                 <w:sz w:val="18"/>
               </w:rPr>
-              <w:t>No se respalda: se recrea con el seed</w:t>
+              <w:t>Se respalda con backup.yml mientras no exista producción (desde el 30/10/2026); en el release v1.0 el secreto DATABASE_URL pasa a la base de producción</w:t>
             </w:r>
           </w:p>
         </w:tc>
@@ -38849,7 +38832,7 @@
               <w:rPr>
                 <w:sz w:val="18"/>
               </w:rPr>
-              <w:t>Revisión de consistencia antes del cierre del Sprint 3. Sección 1, Anexo B y Anexo C: familias (vínculo padre–estudiante, US-20 y consulta del padre de US-11) pasa a ser módulo crítico y entra al coverageThreshold de M06. Sección 11: pdfkit reemplaza a pdfmake y se agrega ioredis. Sección 15 y Anexo F: los pendientes de reglas se cierran con las decisiones D1 a D20. matrices-sqap.xlsx, hoja Métricas: la columna "Dónde se configura" nombra las etapas del Jenkinsfile y no workflows de GitHub Actions que no existen, y M02 se mide en cada build de develop, como dice la Tabla 9. Tabla 1, Sección 3 y Anexo F: cliente piloto, la Unidad Educativa Nazareno, representada por la directora Fabiana Parrado y la profesora Fatima Carreño. Sección 1 y Anexo F: el docente aprobó US-17 a US-20 y dejar los pagos fuera. Sección 9 y 12: el monitor de M13 es UptimeRobot y el equipo se comunica por WhatsApp y Discord. Secciones 5 y 9 y Anexo C: SonarQube Cloud se conectó el 30/10/2026 (T-030); el Quality Gate es "Sonar way", porque el plan gratuito no permite uno propio, y contiene las condiciones de M05, M07 y M08 con los mismos umbrales; como el plan gratuito solo analiza la rama principal, esta es develop y M05, M07 y M08 se miden en cada build de develop.</w:t>
+              <w:t>Revisión de consistencia antes del cierre del Sprint 3. Sección 1, Anexo B y Anexo C: familias (vínculo padre–estudiante, US-20 y consulta del padre de US-11) pasa a ser módulo crítico y entra al coverageThreshold de M06. Sección 11: pdfkit reemplaza a pdfmake y se agrega ioredis. Sección 15 y Anexo F: los pendientes de reglas se cierran con las decisiones D1 a D20. matrices-sqap.xlsx, hoja Métricas: la columna "Dónde se configura" nombra las etapas del Jenkinsfile y no workflows de GitHub Actions que no existen, y M02 se mide en cada build de develop, como dice la Tabla 9. Tabla 1, Sección 3 y Anexo F: cliente piloto, la Unidad Educativa Nazareno, representada por la directora Fabiana Parrado y la profesora Fatima Carreño. Sección 1 y Anexo F: el docente aprobó US-17 a US-20 y dejar los pagos fuera. Sección 9 y 12: el monitor de M13 es UptimeRobot y el equipo se comunica por WhatsApp y Discord. Sección 10: develop es la rama por defecto en GitHub; rulesets de main y develop con el administrador como única excepción en main; respaldos de staging hasta que exista producción (primera restauración: 19 tablas, RTO 1 s) y prueba de restauración cada viernes. Secciones 5 y 9 y Anexo C: SonarQube Cloud se conectó el 30/10/2026 (T-030); el Quality Gate es "Sonar way", porque el plan gratuito no permite uno propio, y contiene las condiciones de M05, M07 y M08 con los mismos umbrales; como el plan gratuito solo analiza la rama principal, esta es develop y M05, M07 y M08 se miden en cada build de develop.</w:t>
             </w:r>
           </w:p>
         </w:tc>

</xml_diff>

<commit_message>
docs(sqap): revisión OWASP del Sprint 3, postmortem de CAL-001 y riesgo R15
Acta de la revisión contra el OWASP Top 10 (ZAP y revisión manual):
H1 y H2 corregidos, H3 (CAL-003) y H4 (CAL-004) abiertos, H5 aceptado.
Postmortem de CAL-001 (S1). CAL-001 y CAL-002 comparten causa: se
registra R15 en el SQAP y en matrices-sqap; helmet entra en la Tabla 24
y en Componentes de terceros.

Refs: CAL-001
</commit_message>
<xml_diff>
--- a/docs/sqap/SQAP-CalisFacu.docx
+++ b/docs/sqap/SQAP-CalisFacu.docx
@@ -27060,6 +27060,80 @@
                 <w:sz w:val="19"/>
               </w:rPr>
               <w:t>Pruebas de carga</w:t>
+            </w:r>
+          </w:p>
+        </w:tc>
+      </w:tr>
+      <w:tr>
+        <w:trPr>
+          <w:cantSplit/>
+        </w:trPr>
+        <w:tc>
+          <w:tcPr>
+            <w:tcW w:w="3700" w:type="dxa"/>
+            <w:tcMar>
+              <w:top w:w="60" w:type="dxa"/>
+              <w:left w:w="100" w:type="dxa"/>
+              <w:bottom w:w="60" w:type="dxa"/>
+              <w:right w:w="100" w:type="dxa"/>
+            </w:tcMar>
+            <w:vAlign w:val="center"/>
+          </w:tcPr>
+          <w:p>
+            <w:pPr>
+              <w:spacing w:after="0" w:line="260" w:lineRule="auto"/>
+            </w:pPr>
+            <w:r>
+              <w:rPr>
+                <w:sz w:val="19"/>
+              </w:rPr>
+              <w:t>helmet</w:t>
+            </w:r>
+          </w:p>
+        </w:tc>
+        <w:tc>
+          <w:tcPr>
+            <w:tcW w:w="1700" w:type="dxa"/>
+            <w:tcMar>
+              <w:top w:w="60" w:type="dxa"/>
+              <w:left w:w="100" w:type="dxa"/>
+              <w:bottom w:w="60" w:type="dxa"/>
+              <w:right w:w="100" w:type="dxa"/>
+            </w:tcMar>
+            <w:vAlign w:val="center"/>
+          </w:tcPr>
+          <w:p>
+            <w:pPr>
+              <w:spacing w:after="0" w:line="260" w:lineRule="auto"/>
+            </w:pPr>
+            <w:r>
+              <w:rPr>
+                <w:sz w:val="19"/>
+              </w:rPr>
+              <w:t>MIT</w:t>
+            </w:r>
+          </w:p>
+        </w:tc>
+        <w:tc>
+          <w:tcPr>
+            <w:tcW w:w="4680" w:type="dxa"/>
+            <w:tcMar>
+              <w:top w:w="60" w:type="dxa"/>
+              <w:left w:w="100" w:type="dxa"/>
+              <w:bottom w:w="60" w:type="dxa"/>
+              <w:right w:w="100" w:type="dxa"/>
+            </w:tcMar>
+            <w:vAlign w:val="center"/>
+          </w:tcPr>
+          <w:p>
+            <w:pPr>
+              <w:spacing w:after="0" w:line="260" w:lineRule="auto"/>
+            </w:pPr>
+            <w:r>
+              <w:rPr>
+                <w:sz w:val="19"/>
+              </w:rPr>
+              <w:t>Cabeceras de seguridad de la API (revisión OWASP del Sprint 3)</w:t>
             </w:r>
           </w:p>
         </w:tc>
@@ -34236,6 +34310,221 @@
           </w:p>
         </w:tc>
       </w:tr>
+      <w:tr>
+        <w:trPr>
+          <w:cantSplit/>
+        </w:trPr>
+        <w:tc>
+          <w:tcPr>
+            <w:tcW w:w="480" w:type="dxa"/>
+            <w:tcMar>
+              <w:top w:w="60" w:type="dxa"/>
+              <w:left w:w="100" w:type="dxa"/>
+              <w:bottom w:w="60" w:type="dxa"/>
+              <w:right w:w="100" w:type="dxa"/>
+            </w:tcMar>
+            <w:vAlign w:val="center"/>
+          </w:tcPr>
+          <w:p>
+            <w:pPr>
+              <w:spacing w:after="0" w:line="260" w:lineRule="auto"/>
+            </w:pPr>
+            <w:r>
+              <w:rPr>
+                <w:sz w:val="16"/>
+              </w:rPr>
+              <w:t>R15</w:t>
+            </w:r>
+          </w:p>
+        </w:tc>
+        <w:tc>
+          <w:tcPr>
+            <w:tcW w:w="1700" w:type="dxa"/>
+            <w:tcMar>
+              <w:top w:w="60" w:type="dxa"/>
+              <w:left w:w="100" w:type="dxa"/>
+              <w:bottom w:w="60" w:type="dxa"/>
+              <w:right w:w="100" w:type="dxa"/>
+            </w:tcMar>
+            <w:vAlign w:val="center"/>
+          </w:tcPr>
+          <w:p>
+            <w:pPr>
+              <w:spacing w:after="0" w:line="260" w:lineRule="auto"/>
+            </w:pPr>
+            <w:r>
+              <w:rPr>
+                <w:sz w:val="16"/>
+              </w:rPr>
+              <w:t>Una automatización (pipeline, despliegue o respaldo) falla o no se ejecuta sin que nadie lo note</w:t>
+            </w:r>
+          </w:p>
+        </w:tc>
+        <w:tc>
+          <w:tcPr>
+            <w:tcW w:w="330" w:type="dxa"/>
+            <w:tcMar>
+              <w:top w:w="60" w:type="dxa"/>
+              <w:left w:w="100" w:type="dxa"/>
+              <w:bottom w:w="60" w:type="dxa"/>
+              <w:right w:w="100" w:type="dxa"/>
+            </w:tcMar>
+            <w:vAlign w:val="center"/>
+          </w:tcPr>
+          <w:p>
+            <w:pPr>
+              <w:spacing w:after="0" w:line="260" w:lineRule="auto"/>
+              <w:jc w:val="center"/>
+            </w:pPr>
+            <w:r>
+              <w:rPr>
+                <w:sz w:val="16"/>
+              </w:rPr>
+              <w:t>2</w:t>
+            </w:r>
+          </w:p>
+        </w:tc>
+        <w:tc>
+          <w:tcPr>
+            <w:tcW w:w="330" w:type="dxa"/>
+            <w:tcMar>
+              <w:top w:w="60" w:type="dxa"/>
+              <w:left w:w="100" w:type="dxa"/>
+              <w:bottom w:w="60" w:type="dxa"/>
+              <w:right w:w="100" w:type="dxa"/>
+            </w:tcMar>
+            <w:vAlign w:val="center"/>
+          </w:tcPr>
+          <w:p>
+            <w:pPr>
+              <w:spacing w:after="0" w:line="260" w:lineRule="auto"/>
+              <w:jc w:val="center"/>
+            </w:pPr>
+            <w:r>
+              <w:rPr>
+                <w:sz w:val="16"/>
+              </w:rPr>
+              <w:t>3</w:t>
+            </w:r>
+          </w:p>
+        </w:tc>
+        <w:tc>
+          <w:tcPr>
+            <w:tcW w:w="650" w:type="dxa"/>
+            <w:tcMar>
+              <w:top w:w="60" w:type="dxa"/>
+              <w:left w:w="100" w:type="dxa"/>
+              <w:bottom w:w="60" w:type="dxa"/>
+              <w:right w:w="100" w:type="dxa"/>
+            </w:tcMar>
+            <w:vAlign w:val="center"/>
+          </w:tcPr>
+          <w:p>
+            <w:pPr>
+              <w:spacing w:after="0" w:line="260" w:lineRule="auto"/>
+              <w:jc w:val="center"/>
+            </w:pPr>
+            <w:r>
+              <w:rPr>
+                <w:sz w:val="16"/>
+              </w:rPr>
+              <w:t>6 Alto</w:t>
+            </w:r>
+          </w:p>
+        </w:tc>
+        <w:tc>
+          <w:tcPr>
+            <w:tcW w:w="2350" w:type="dxa"/>
+            <w:tcMar>
+              <w:top w:w="60" w:type="dxa"/>
+              <w:left w:w="100" w:type="dxa"/>
+              <w:bottom w:w="60" w:type="dxa"/>
+              <w:right w:w="100" w:type="dxa"/>
+            </w:tcMar>
+            <w:vAlign w:val="center"/>
+          </w:tcPr>
+          <w:p>
+            <w:pPr>
+              <w:spacing w:after="0" w:line="260" w:lineRule="auto"/>
+            </w:pPr>
+            <w:r>
+              <w:rPr>
+                <w:sz w:val="16"/>
+              </w:rPr>
+              <w:t>Revisar cada día hábil el último build de develop y los runs de backup (postmortem CAL-001); UptimeRobot cada 5 min; la imagen comprueba sus dependencias al construirse.</w:t>
+            </w:r>
+          </w:p>
+        </w:tc>
+        <w:tc>
+          <w:tcPr>
+            <w:tcW w:w="700" w:type="dxa"/>
+            <w:tcMar>
+              <w:top w:w="60" w:type="dxa"/>
+              <w:left w:w="100" w:type="dxa"/>
+              <w:bottom w:w="60" w:type="dxa"/>
+              <w:right w:w="100" w:type="dxa"/>
+            </w:tcMar>
+            <w:vAlign w:val="center"/>
+          </w:tcPr>
+          <w:p>
+            <w:pPr>
+              <w:spacing w:after="0" w:line="260" w:lineRule="auto"/>
+            </w:pPr>
+            <w:r>
+              <w:rPr>
+                <w:sz w:val="16"/>
+              </w:rPr>
+              <w:t>Galvan</w:t>
+            </w:r>
+          </w:p>
+        </w:tc>
+        <w:tc>
+          <w:tcPr>
+            <w:tcW w:w="1640" w:type="dxa"/>
+            <w:tcMar>
+              <w:top w:w="60" w:type="dxa"/>
+              <w:left w:w="100" w:type="dxa"/>
+              <w:bottom w:w="60" w:type="dxa"/>
+              <w:right w:w="100" w:type="dxa"/>
+            </w:tcMar>
+            <w:vAlign w:val="center"/>
+          </w:tcPr>
+          <w:p>
+            <w:pPr>
+              <w:spacing w:after="0" w:line="260" w:lineRule="auto"/>
+            </w:pPr>
+            <w:r>
+              <w:rPr>
+                <w:sz w:val="16"/>
+              </w:rPr>
+              <w:t>Un build de develop o un run de backup en rojo más de 1 día hábil</w:t>
+            </w:r>
+          </w:p>
+        </w:tc>
+        <w:tc>
+          <w:tcPr>
+            <w:tcW w:w="1900" w:type="dxa"/>
+            <w:tcMar>
+              <w:top w:w="60" w:type="dxa"/>
+              <w:left w:w="100" w:type="dxa"/>
+              <w:bottom w:w="60" w:type="dxa"/>
+              <w:right w:w="100" w:type="dxa"/>
+            </w:tcMar>
+            <w:vAlign w:val="center"/>
+          </w:tcPr>
+          <w:p>
+            <w:pPr>
+              <w:spacing w:after="0" w:line="260" w:lineRule="auto"/>
+            </w:pPr>
+            <w:r>
+              <w:rPr>
+                <w:sz w:val="16"/>
+              </w:rPr>
+              <w:t>Se registra como defecto S2 y se corrige antes que cualquier tarea del sprint.</w:t>
+            </w:r>
+          </w:p>
+        </w:tc>
+      </w:tr>
     </w:tbl>
     <w:p>
       <w:pPr>
@@ -38832,7 +39121,7 @@
               <w:rPr>
                 <w:sz w:val="18"/>
               </w:rPr>
-              <w:t>Revisión de consistencia antes del cierre del Sprint 3. Sección 1, Anexo B y Anexo C: familias (vínculo padre–estudiante, US-20 y consulta del padre de US-11) pasa a ser módulo crítico y entra al coverageThreshold de M06. Sección 11: pdfkit reemplaza a pdfmake y se agrega ioredis. Sección 15 y Anexo F: los pendientes de reglas se cierran con las decisiones D1 a D20. matrices-sqap.xlsx, hoja Métricas: la columna "Dónde se configura" nombra las etapas del Jenkinsfile y no workflows de GitHub Actions que no existen, y M02 se mide en cada build de develop, como dice la Tabla 9. Tabla 1, Sección 3 y Anexo F: cliente piloto, la Unidad Educativa Nazareno, representada por la directora Fabiana Parrado y la profesora Fatima Carreño. Sección 1 y Anexo F: el docente aprobó US-17 a US-20 y dejar los pagos fuera. Sección 9 y 12: el monitor de M13 es UptimeRobot y el equipo se comunica por WhatsApp y Discord. Sección 10: develop es la rama por defecto en GitHub; rulesets de main y develop con el administrador como única excepción en main; respaldos de staging hasta que exista producción (primera restauración: 19 tablas, RTO 1 s) y prueba de restauración cada viernes. Secciones 5 y 9 y Anexo C: SonarQube Cloud se conectó el 30/10/2026 (T-030); el Quality Gate es "Sonar way", porque el plan gratuito no permite uno propio, y contiene las condiciones de M05, M07 y M08 con los mismos umbrales; como el plan gratuito solo analiza la rama principal, esta es develop y M05, M07 y M08 se miden en cada build de develop.</w:t>
+              <w:t>Revisión de consistencia antes del cierre del Sprint 3. Sección 1, Anexo B y Anexo C: familias (vínculo padre–estudiante, US-20 y consulta del padre de US-11) pasa a ser módulo crítico y entra al coverageThreshold de M06. Sección 11: pdfkit reemplaza a pdfmake y se agrega ioredis. Sección 15 y Anexo F: los pendientes de reglas se cierran con las decisiones D1 a D20. matrices-sqap.xlsx, hoja Métricas: la columna "Dónde se configura" nombra las etapas del Jenkinsfile y no workflows de GitHub Actions que no existen, y M02 se mide en cada build de develop, como dice la Tabla 9. Tabla 1, Sección 3 y Anexo F: cliente piloto, la Unidad Educativa Nazareno, representada por la directora Fabiana Parrado y la profesora Fatima Carreño. Sección 1 y Anexo F: el docente aprobó US-17 a US-20 y dejar los pagos fuera. Sección 9 y 12: el monitor de M13 es UptimeRobot y el equipo se comunica por WhatsApp y Discord. Sección 10: develop es la rama por defecto en GitHub; rulesets de main y develop con el administrador como única excepción en main; respaldos de staging hasta que exista producción (primera restauración: 19 tablas, RTO 1 s) y prueba de restauración cada viernes. Secciones 8, 11 y 14: CAL-001 y CAL-002 comparten causa (automatizaciones que fallan sin que nadie lo note) y se registra el riesgo R15; helmet entra en la Tabla 24 por la revisión OWASP del Sprint 3. Secciones 5 y 9 y Anexo C: SonarQube Cloud se conectó el 30/10/2026 (T-030); el Quality Gate es "Sonar way", porque el plan gratuito no permite uno propio, y contiene las condiciones de M05, M07 y M08 con los mismos umbrales; como el plan gratuito solo analiza la rama principal, esta es develop y M05, M07 y M08 se miden en cada build de develop.</w:t>
             </w:r>
           </w:p>
         </w:tc>
@@ -48688,7 +48977,7 @@
               <w:rPr>
                 <w:sz w:val="20"/>
               </w:rPr>
-              <w:t>Cada métrica cita un RNF o un riesgo; cada historia tiene su trazabilidad en el Anexo B; los nueve riesgos altos tienen mitigación con responsable.</w:t>
+              <w:t>Cada métrica cita un RNF o un riesgo; cada historia tiene su trazabilidad en el Anexo B; los diez riesgos altos tienen mitigación con responsable.</w:t>
             </w:r>
           </w:p>
         </w:tc>

</xml_diff>